<commit_message>
feat: widen OS WS and AS counts to nine bits
</commit_message>
<xml_diff>
--- a/docs/CIM_Block_Spec.docx
+++ b/docs/CIM_Block_Spec.docx
@@ -21,7 +21,7 @@
         <w:spacing w:after="120" w:line="312" w:lineRule="auto"/>
       </w:pPr>
       <w:r>
-        <w:t xml:space="preserve">版本说明：2026年10月30日按main提交b1a5eca同步接口、AS调度、Requant、仿真溢出检查及测试入口。本次仅修订文档，未重跑仿真或进行综合、STA及功耗验证。</w:t>
+        <w:t xml:space="preserve">版本说明：2026年10月30日将OS/WS/AS count扩为9bit，descriptor为110bit，RTL、TB及接口文档同步。ModelSim的11个目标编译、默认Cluster回归和36个OS边界场景通过；未进行工艺综合、STA或功耗验证。</w:t>
       </w:r>
     </w:p>
     <w:p>
@@ -4044,7 +4044,7 @@
                 <w:color w:val="000000"/>
                 <w:sz w:val="18"/>
               </w:rPr>
-              <w:t>每Tile/Context一次descriptor，CTRL_W=107；三个count各8 bit</w:t>
+              <w:t>每Tile/Context一次descriptor，CTRL_W=110；三个count各9 bit</w:t>
             </w:r>
           </w:p>
         </w:tc>
@@ -5299,7 +5299,7 @@
         <w:spacing w:after="120" w:line="312" w:lineRule="auto"/>
       </w:pPr>
       <w:r>
-        <w:t>每Tile/Context提交一次compute descriptor，cmd_fire=cmd_valid_i&amp;&amp;cmd_ready_o采样；首命令同时接收A0。三个count各8bit，CTRL_W=107。AS后续compute descriptor仅改变Context地址，公共计算字段一致；独立requant_cfg_i按Context提供量化参数，见6.1节。</w:t>
+        <w:t>每Tile/Context提交一次compute descriptor，cmd_fire=cmd_valid_i&amp;&amp;cmd_ready_o采样；首命令同时接收A0。三个count各9bit，CTRL_W=110。AS后续compute descriptor仅改变Context地址，公共计算字段一致；独立requant_cfg_i按Context提供量化参数，见6.1节。</w:t>
       </w:r>
     </w:p>
     <w:tbl>
@@ -5505,33 +5505,33 @@
                 <w:color w:val="000000"/>
                 <w:sz w:val="18"/>
               </w:rPr>
-              <w:t>8</w:t>
-            </w:r>
-          </w:p>
-        </w:tc>
-        <w:tc>
-          <w:tcPr>
-            <w:vAlign w:val="center"/>
-            <w:shd w:fill="FFFFFF"/>
-            <w:tcMar>
-              <w:top w:w="70" w:type="dxa"/>
-              <w:left w:w="70" w:type="dxa"/>
-              <w:bottom w:w="70" w:type="dxa"/>
-              <w:right w:w="70" w:type="dxa"/>
-            </w:tcMar>
-          </w:tcPr>
-          <w:p>
-            <w:pPr>
-              <w:keepNext w:val="0"/>
-              <w:spacing w:before="40" w:after="40"/>
-            </w:pPr>
-            <w:r>
-              <w:rPr>
-                <w:b w:val="0"/>
-                <w:color w:val="000000"/>
-                <w:sz w:val="18"/>
-              </w:rPr>
-              <w:t>每Context的K Tile次数，1～255；仍需满足signed32范围</w:t>
+              <w:t>9</w:t>
+            </w:r>
+          </w:p>
+        </w:tc>
+        <w:tc>
+          <w:tcPr>
+            <w:vAlign w:val="center"/>
+            <w:shd w:fill="FFFFFF"/>
+            <w:tcMar>
+              <w:top w:w="70" w:type="dxa"/>
+              <w:left w:w="70" w:type="dxa"/>
+              <w:bottom w:w="70" w:type="dxa"/>
+              <w:right w:w="70" w:type="dxa"/>
+            </w:tcMar>
+          </w:tcPr>
+          <w:p>
+            <w:pPr>
+              <w:keepNext w:val="0"/>
+              <w:spacing w:before="40" w:after="40"/>
+            </w:pPr>
+            <w:r>
+              <w:rPr>
+                <w:b w:val="0"/>
+                <w:color w:val="000000"/>
+                <w:sz w:val="18"/>
+              </w:rPr>
+              <w:t>每Context的K Tile次数，1～511；仍需满足signed32范围</w:t>
             </w:r>
           </w:p>
         </w:tc>
@@ -5607,33 +5607,33 @@
                 <w:color w:val="000000"/>
                 <w:sz w:val="18"/>
               </w:rPr>
-              <w:t>8</w:t>
-            </w:r>
-          </w:p>
-        </w:tc>
-        <w:tc>
-          <w:tcPr>
-            <w:vAlign w:val="center"/>
-            <w:shd w:fill="FFFFFF"/>
-            <w:tcMar>
-              <w:top w:w="70" w:type="dxa"/>
-              <w:left w:w="70" w:type="dxa"/>
-              <w:bottom w:w="70" w:type="dxa"/>
-              <w:right w:w="70" w:type="dxa"/>
-            </w:tcMar>
-          </w:tcPr>
-          <w:p>
-            <w:pPr>
-              <w:keepNext w:val="0"/>
-              <w:spacing w:before="40" w:after="40"/>
-            </w:pPr>
-            <w:r>
-              <w:rPr>
-                <w:b w:val="0"/>
-                <w:color w:val="000000"/>
-                <w:sz w:val="18"/>
-              </w:rPr>
-              <w:t>WS Context数，1～255编码；OS1容量上限64，OS&gt;1默认16</w:t>
+              <w:t>9</w:t>
+            </w:r>
+          </w:p>
+        </w:tc>
+        <w:tc>
+          <w:tcPr>
+            <w:vAlign w:val="center"/>
+            <w:shd w:fill="FFFFFF"/>
+            <w:tcMar>
+              <w:top w:w="70" w:type="dxa"/>
+              <w:left w:w="70" w:type="dxa"/>
+              <w:bottom w:w="70" w:type="dxa"/>
+              <w:right w:w="70" w:type="dxa"/>
+            </w:tcMar>
+          </w:tcPr>
+          <w:p>
+            <w:pPr>
+              <w:keepNext w:val="0"/>
+              <w:spacing w:before="40" w:after="40"/>
+            </w:pPr>
+            <w:r>
+              <w:rPr>
+                <w:b w:val="0"/>
+                <w:color w:val="000000"/>
+                <w:sz w:val="18"/>
+              </w:rPr>
+              <w:t>WS Context数，1～511编码；OS1容量上限64，OS&gt;1默认16</w:t>
             </w:r>
           </w:p>
         </w:tc>
@@ -5713,33 +5713,33 @@
                 <w:color w:val="000000"/>
                 <w:sz w:val="18"/>
               </w:rPr>
-              <w:t>8</w:t>
-            </w:r>
-          </w:p>
-        </w:tc>
-        <w:tc>
-          <w:tcPr>
-            <w:vAlign w:val="center"/>
-            <w:shd w:fill="FFFFFF"/>
-            <w:tcMar>
-              <w:top w:w="70" w:type="dxa"/>
-              <w:left w:w="70" w:type="dxa"/>
-              <w:bottom w:w="70" w:type="dxa"/>
-              <w:right w:w="70" w:type="dxa"/>
-            </w:tcMar>
-          </w:tcPr>
-          <w:p>
-            <w:pPr>
-              <w:keepNext w:val="0"/>
-              <w:spacing w:before="40" w:after="40"/>
-            </w:pPr>
-            <w:r>
-              <w:rPr>
-                <w:b w:val="0"/>
-                <w:color w:val="000000"/>
-                <w:sz w:val="18"/>
-              </w:rPr>
-              <w:t>AS Context数，编码1～255，所有精度有效上限16</w:t>
+              <w:t>9</w:t>
+            </w:r>
+          </w:p>
+        </w:tc>
+        <w:tc>
+          <w:tcPr>
+            <w:vAlign w:val="center"/>
+            <w:shd w:fill="FFFFFF"/>
+            <w:tcMar>
+              <w:top w:w="70" w:type="dxa"/>
+              <w:left w:w="70" w:type="dxa"/>
+              <w:bottom w:w="70" w:type="dxa"/>
+              <w:right w:w="70" w:type="dxa"/>
+            </w:tcMar>
+          </w:tcPr>
+          <w:p>
+            <w:pPr>
+              <w:keepNext w:val="0"/>
+              <w:spacing w:before="40" w:after="40"/>
+            </w:pPr>
+            <w:r>
+              <w:rPr>
+                <w:b w:val="0"/>
+                <w:color w:val="000000"/>
+                <w:sz w:val="18"/>
+              </w:rPr>
+              <w:t>AS Context数，编码1～511，所有精度有效上限16</w:t>
             </w:r>
           </w:p>
         </w:tc>
@@ -6769,7 +6769,7 @@
         <w:keepLines/>
       </w:pPr>
       <w:r>
-        <w:t>声明级资源统计：独立权重数据减少8192bit，冗余read_address_in/station_in输入状态减少72bit。默认逻辑DFF名义33485bit（按仓库声明级统计口径，非综合单元数），SRAM读出保持模型8192bit另列，ICG锁存位684；这不是综合网表单元数或面积。 批次描述符共享；四级窄事务标签68bit、三路径tmp标签51bit、逐lane tmp valid32bit、三路径raw Context指针18bit。raw直接观察对应tmp/Psum，不保留独立raw数据DFF；相对逐lane完整标签和raw副本减少10407bit。</w:t>
+        <w:t>声明级资源统计：独立权重数据减少8192bit，冗余read_address_in/station_in输入状态减少72bit。默认逻辑DFF名义33496bit（按仓库声明级统计口径，非综合单元数），SRAM读出保持模型8192bit另列，ICG锁存位684；这不是综合网表单元数或面积。 批次描述符共享；四级窄事务标签72bit、三路径tmp标签54bit、逐lane tmp valid32bit、三路径raw Context指针18bit。raw直接观察对应tmp/Psum，不保留独立raw数据DFF；相对逐lane完整标签和raw副本减少10407bit。</w:t>
       </w:r>
       <w:r>
         <w:t xml:space="preserve"> OUTPUT_PSUM_DEPTH默认16，统一控制Psum、权重地址表、Requant Context表深度；三个兼容深度参数默认联动，容量负向测试可单独覆盖。每个物理OC一套acc和一套bit-fusion组合算术，由所有Context复用，不随Context深度复制。</w:t>
@@ -6817,7 +6817,7 @@
           <w:color w:val="000000"/>
           <w:sz w:val="19"/>
         </w:rPr>
-        <w:t>cim_os_cnt、cim_ws_cnt、cim_as_cnt 均为 8 bit，合法字段值为 1～255，0 非法，256 不可编码；cluster_ctrl_t 总宽度 CTRL_W=107 bit。OS 上限 255 指每个 Context 的 K Tile 累加次数，仍需满足 signed32 不溢出的数值约束。WS/AS 的字段位宽不代表可忽略存储容量上限。</w:t>
+        <w:t>cim_os_cnt、cim_ws_cnt、cim_as_cnt 均为 9 bit，合法字段值为 1～511，0 非法，512 不可编码；cluster_ctrl_t 总宽度 CTRL_W=110 bit。OS 上限 511 指每个 Context 的 K Tile 累加次数，仍需满足 signed32 不溢出的数值约束。WS/AS 的字段位宽不代表可忽略存储容量上限。</w:t>
       </w:r>
     </w:p>
     <w:p>
@@ -6843,7 +6843,7 @@
           <w:color w:val="000000"/>
           <w:sz w:val="19"/>
         </w:rPr>
-        <w:t>所有精度cim_as_cnt≤OUTPUT_BUFFER_DEPTH=16，OS1/OS&gt;1相同；OS1 WS最多64，OS&gt;1 WS最多16，还需满足标签、地址和参数表容量。三个count均为8bit、1～255编码，0非法。</w:t>
+        <w:t>所有精度cim_as_cnt≤OUTPUT_BUFFER_DEPTH=16，OS1/OS&gt;1相同；OS1 WS最多64，OS&gt;1 WS最多16，还需满足标签、地址和参数表容量。三个count均为9bit、1～511编码，0非法。</w:t>
       </w:r>
     </w:p>
     <w:p>
@@ -7494,7 +7494,7 @@
                 <w:color w:val="000000"/>
                 <w:sz w:val="18"/>
               </w:rPr>
-              <w:t>1～255 / 每字段8 bit</w:t>
+              <w:t>1～511 / 每字段9 bit</w:t>
             </w:r>
           </w:p>
         </w:tc>
@@ -7523,7 +7523,7 @@
                 <w:color w:val="000000"/>
                 <w:sz w:val="18"/>
               </w:rPr>
-              <w:t>不是 Psum 深度；descriptor 共107 bit</w:t>
+              <w:t>不是 Psum 深度；descriptor 共110 bit</w:t>
             </w:r>
           </w:p>
         </w:tc>
@@ -10869,7 +10869,7 @@
                 <w:color w:val="000000"/>
                 <w:sz w:val="18"/>
               </w:rPr>
-              <w:t>Psum；cim_os_cnt为1～255个K Tile</w:t>
+              <w:t>Psum；cim_os_cnt为1～511个K Tile</w:t>
             </w:r>
           </w:p>
         </w:tc>
@@ -12791,7 +12791,7 @@
         <w:spacing w:after="120" w:line="312" w:lineRule="auto"/>
       </w:pPr>
       <w:r>
-        <w:t>所有多Context AS采用Tile→Slice→Context。Psum在OS&gt;1或多Context AS时使用，包括OS1/A4。AS所有精度最多16，WS OS1最多64、OS&gt;1最多16。三个count各8bit，范围1～255，WS/AS不能同时大于1；还须满足地址、参数、标签容量。</w:t>
+        <w:t>所有多Context AS采用Tile→Slice→Context。Psum在OS&gt;1或多Context AS时使用，包括OS1/A4。AS所有精度最多16，WS OS1最多64、OS&gt;1最多16。三个count各9bit，范围1～511，WS/AS不能同时大于1；还须满足地址、参数、标签容量。</w:t>
       </w:r>
     </w:p>
     <w:bookmarkEnd w:id="14"/>
@@ -13451,7 +13451,7 @@
         <w:spacing w:after="120" w:line="312" w:lineRule="auto"/>
       </w:pPr>
       <w:r>
-        <w:t>所有多Context AS采用Tile→Slice→Context，包括OS1。Psum使用条件为cim_os_cnt&gt;1或cim_as_cnt&gt;1；WS/单Context仅OS&gt;1写Psum，所有多Context AS（包括OS1/A4）保存各Context结果至Psum。所有精度cim_as_cnt≤OUTPUT_BUFFER_DEPTH=16，OS1/OS&gt;1相同；OS1 WS最多64，OS&gt;1 WS最多16，还需满足标签、地址和参数表容量。三个count均为8bit、1～255编码，0非法。</w:t>
+        <w:t>所有多Context AS采用Tile→Slice→Context，包括OS1。Psum使用条件为cim_os_cnt&gt;1或cim_as_cnt&gt;1；WS/单Context仅OS&gt;1写Psum，所有多Context AS（包括OS1/A4）保存各Context结果至Psum。所有精度cim_as_cnt≤OUTPUT_BUFFER_DEPTH=16，OS1/OS&gt;1相同；OS1 WS最多64，OS&gt;1 WS最多16，还需满足标签、地址和参数表容量。三个count均为9bit、1～511编码，0非法。</w:t>
       </w:r>
     </w:p>
     <w:bookmarkEnd w:id="25"/>
@@ -14080,7 +14080,7 @@
         <w:spacing w:after="120" w:line="312" w:lineRule="auto"/>
       </w:pPr>
       <w:r>
-        <w:t>当前集成约束：调用方必须保证每次tmp/Psum写入值均在-2147483648～2147483647内，UINT还须非负，不能只保证最终数学和不溢出。Requant末端INT8 clip无法修复先前回绕。cim_os_cnt的8bit/255编码上限与安全累加次数是两类约束。</w:t>
+        <w:t>当前集成约束：调用方必须保证每次tmp/Psum写入值均在-2147483648～2147483647内，UINT还须非负，不能只保证最终数学和不溢出。Requant末端INT8 clip无法修复先前回绕。cim_os_cnt的9bit/511编码上限与安全累加次数是两类约束。</w:t>
       </w:r>
     </w:p>
     <w:bookmarkEnd w:id="26"/>
@@ -14700,7 +14700,7 @@
         <w:spacing w:after="120" w:line="312" w:lineRule="auto"/>
       </w:pPr>
       <w:r>
-        <w:t xml:space="preserve">Requant配置采用独立297-bit requant_cfg_t：仅conv_mode为1bit，另有4×INT32 multiplier、4×INT10 shift、4×INT32 zp；当前接口没有requant_mode字段。conv_mode=0选择per-tensor，第0项scale广播；conv_mode=1选择per-channel，OC c使用参数c。屏蔽OC不会压缩参数索引。107-bit compute descriptor不变。</w:t>
+        <w:t xml:space="preserve">Requant配置采用独立297-bit requant_cfg_t：仅conv_mode为1bit，另有4×INT32 multiplier、4×INT10 shift、4×INT32 zp；当前接口没有requant_mode字段。conv_mode=0选择per-tensor，第0项scale广播；conv_mode=1选择per-channel，OC c使用参数c。屏蔽OC不会压缩参数索引。110-bit compute descriptor不变。</w:t>
       </w:r>
     </w:p>
     <w:p>
@@ -17130,7 +17130,7 @@
         <w:spacing w:after="120" w:line="312" w:lineRule="auto"/>
       </w:pPr>
       <w:r>
-        <w:t>单bank同包接收/发射重叠：WS包间隔P+1，AS每Tile间隔1+R×P。所有多Context AS采用Tile→Slice→Context，包括OS1。Psum使用条件为cim_os_cnt&gt;1或cim_as_cnt&gt;1；WS/单Context仅OS&gt;1写Psum，所有多Context AS（包括OS1/A4）保存各Context结果至Psum。所有精度cim_as_cnt≤OUTPUT_BUFFER_DEPTH=16，OS1/OS&gt;1相同；OS1 WS最多64，OS&gt;1 WS最多16，还需满足标签、地址和参数表容量。三个count均为8bit、1～255编码，0非法。</w:t>
+        <w:t>单bank同包接收/发射重叠：WS包间隔P+1，AS每Tile间隔1+R×P。所有多Context AS采用Tile→Slice→Context，包括OS1。Psum使用条件为cim_os_cnt&gt;1或cim_as_cnt&gt;1；WS/单Context仅OS&gt;1写Psum，所有多Context AS（包括OS1/A4）保存各Context结果至Psum。所有精度cim_as_cnt≤OUTPUT_BUFFER_DEPTH=16，OS1/OS&gt;1相同；OS1 WS最多64，OS&gt;1 WS最多16，还需满足标签、地址和参数表容量。三个count均为9bit、1～511编码，0非法。</w:t>
       </w:r>
     </w:p>
     <w:bookmarkEnd w:id="31"/>

</xml_diff>